<commit_message>
Fix: bw gradation images looks more clear
</commit_message>
<xml_diff>
--- a/paper/Квардонов_Толкачев_PCB_defect_detection.docx
+++ b/paper/Квардонов_Толкачев_PCB_defect_detection.docx
@@ -583,10 +583,10 @@
           <w:lang w:val="en-US"/>
         </w:rPr>
         <w:drawing>
-          <wp:inline distT="0" distB="0" distL="0" distR="0" wp14:anchorId="0A6CD23F" wp14:editId="13B692F5">
-            <wp:extent cx="4692770" cy="5328177"/>
-            <wp:effectExtent l="0" t="0" r="0" b="6350"/>
-            <wp:docPr id="672385273" name="Picture 1"/>
+          <wp:inline distT="0" distB="0" distL="0" distR="0" wp14:anchorId="5814C80B" wp14:editId="0201B652">
+            <wp:extent cx="6120130" cy="4868545"/>
+            <wp:effectExtent l="0" t="0" r="0" b="8255"/>
+            <wp:docPr id="462532011" name="Picture 4"/>
             <wp:cNvGraphicFramePr>
               <a:graphicFrameLocks xmlns:a="http://schemas.openxmlformats.org/drawingml/2006/main" noChangeAspect="1"/>
             </wp:cNvGraphicFramePr>
@@ -594,7 +594,7 @@
               <a:graphicData uri="http://schemas.openxmlformats.org/drawingml/2006/picture">
                 <pic:pic xmlns:pic="http://schemas.openxmlformats.org/drawingml/2006/picture">
                   <pic:nvPicPr>
-                    <pic:cNvPr id="672385273" name="Picture 672385273"/>
+                    <pic:cNvPr id="462532011" name="Picture 462532011"/>
                     <pic:cNvPicPr/>
                   </pic:nvPicPr>
                   <pic:blipFill>
@@ -612,7 +612,7 @@
                   <pic:spPr>
                     <a:xfrm>
                       <a:off x="0" y="0"/>
-                      <a:ext cx="4726953" cy="5366989"/>
+                      <a:ext cx="6120130" cy="4868545"/>
                     </a:xfrm>
                     <a:prstGeom prst="rect">
                       <a:avLst/>
@@ -685,7 +685,13 @@
       </w:r>
       <w:proofErr w:type="spellEnd"/>
       <w:r>
-        <w:t xml:space="preserve"> 16. Применялась аугментация: мозаичное смешивание (</w:t>
+        <w:t xml:space="preserve"> </w:t>
+      </w:r>
+      <w:r>
+        <w:t>32</w:t>
+      </w:r>
+      <w:r>
+        <w:t>. Применялась аугментация: мозаичное смешивание (</w:t>
       </w:r>
       <w:proofErr w:type="spellStart"/>
       <w:r>
@@ -693,23 +699,19 @@
       </w:r>
       <w:proofErr w:type="spellEnd"/>
       <w:r>
-        <w:t xml:space="preserve">=1.0), </w:t>
-      </w:r>
-      <w:proofErr w:type="spellStart"/>
-      <w:r>
-        <w:t>MixUp</w:t>
-      </w:r>
-      <w:proofErr w:type="spellEnd"/>
-      <w:r>
-        <w:t xml:space="preserve"> (</w:t>
-      </w:r>
-      <w:proofErr w:type="spellStart"/>
-      <w:r>
-        <w:t>mixup</w:t>
-      </w:r>
-      <w:proofErr w:type="spellEnd"/>
-      <w:r>
-        <w:t>=0.1), горизонтальное зеркалирование (</w:t>
+        <w:t>=</w:t>
+      </w:r>
+      <w:r>
+        <w:t>0</w:t>
+      </w:r>
+      <w:r>
+        <w:t>.</w:t>
+      </w:r>
+      <w:r>
+        <w:t>5</w:t>
+      </w:r>
+      <w:r>
+        <w:t>), горизонтальное зеркалирование (</w:t>
       </w:r>
       <w:proofErr w:type="spellStart"/>
       <w:r>
@@ -811,17 +813,18 @@
     <w:tbl>
       <w:tblPr>
         <w:tblStyle w:val="TableGrid"/>
-        <w:tblW w:w="8787" w:type="dxa"/>
+        <w:tblW w:w="5000" w:type="pct"/>
         <w:jc w:val="center"/>
         <w:tblLook w:val="04A0" w:firstRow="1" w:lastRow="0" w:firstColumn="1" w:lastColumn="0" w:noHBand="0" w:noVBand="1"/>
       </w:tblPr>
       <w:tblGrid>
-        <w:gridCol w:w="1743"/>
-        <w:gridCol w:w="1410"/>
-        <w:gridCol w:w="1760"/>
-        <w:gridCol w:w="1374"/>
-        <w:gridCol w:w="1197"/>
-        <w:gridCol w:w="1303"/>
+        <w:gridCol w:w="1512"/>
+        <w:gridCol w:w="1385"/>
+        <w:gridCol w:w="1933"/>
+        <w:gridCol w:w="1279"/>
+        <w:gridCol w:w="940"/>
+        <w:gridCol w:w="1152"/>
+        <w:gridCol w:w="1427"/>
       </w:tblGrid>
       <w:tr>
         <w:trPr>
@@ -830,7 +833,7 @@
         </w:trPr>
         <w:tc>
           <w:tcPr>
-            <w:tcW w:w="1743" w:type="dxa"/>
+            <w:tcW w:w="785" w:type="pct"/>
             <w:vAlign w:val="center"/>
           </w:tcPr>
           <w:p>
@@ -852,7 +855,7 @@
         </w:tc>
         <w:tc>
           <w:tcPr>
-            <w:tcW w:w="1410" w:type="dxa"/>
+            <w:tcW w:w="719" w:type="pct"/>
             <w:vAlign w:val="center"/>
           </w:tcPr>
           <w:p>
@@ -874,7 +877,7 @@
         </w:tc>
         <w:tc>
           <w:tcPr>
-            <w:tcW w:w="1760" w:type="dxa"/>
+            <w:tcW w:w="1004" w:type="pct"/>
             <w:vAlign w:val="center"/>
           </w:tcPr>
           <w:p>
@@ -896,7 +899,7 @@
         </w:tc>
         <w:tc>
           <w:tcPr>
-            <w:tcW w:w="1374" w:type="dxa"/>
+            <w:tcW w:w="664" w:type="pct"/>
             <w:vAlign w:val="center"/>
           </w:tcPr>
           <w:p>
@@ -918,7 +921,7 @@
         </w:tc>
         <w:tc>
           <w:tcPr>
-            <w:tcW w:w="1197" w:type="dxa"/>
+            <w:tcW w:w="488" w:type="pct"/>
             <w:vAlign w:val="center"/>
           </w:tcPr>
           <w:p>
@@ -942,7 +945,7 @@
         </w:tc>
         <w:tc>
           <w:tcPr>
-            <w:tcW w:w="1303" w:type="dxa"/>
+            <w:tcW w:w="598" w:type="pct"/>
             <w:vAlign w:val="center"/>
           </w:tcPr>
           <w:p>
@@ -959,6 +962,181 @@
                 <w:szCs w:val="24"/>
               </w:rPr>
               <w:t>Размер</w:t>
+            </w:r>
+          </w:p>
+        </w:tc>
+        <w:tc>
+          <w:tcPr>
+            <w:tcW w:w="741" w:type="pct"/>
+            <w:vAlign w:val="center"/>
+          </w:tcPr>
+          <w:p>
+            <w:pPr>
+              <w:spacing w:line="276" w:lineRule="auto"/>
+              <w:ind w:firstLine="0"/>
+              <w:jc w:val="center"/>
+              <w:rPr>
+                <w:b/>
+                <w:bCs/>
+                <w:sz w:val="24"/>
+              </w:rPr>
+            </w:pPr>
+            <w:proofErr w:type="spellStart"/>
+            <w:r>
+              <w:rPr>
+                <w:b/>
+                <w:bCs/>
+                <w:sz w:val="24"/>
+              </w:rPr>
+              <w:t>Инференс</w:t>
+            </w:r>
+            <w:proofErr w:type="spellEnd"/>
+          </w:p>
+        </w:tc>
+      </w:tr>
+      <w:tr>
+        <w:trPr>
+          <w:trHeight w:val="459"/>
+          <w:jc w:val="center"/>
+        </w:trPr>
+        <w:tc>
+          <w:tcPr>
+            <w:tcW w:w="785" w:type="pct"/>
+            <w:vAlign w:val="center"/>
+          </w:tcPr>
+          <w:p>
+            <w:pPr>
+              <w:spacing w:line="276" w:lineRule="auto"/>
+              <w:ind w:firstLine="0"/>
+              <w:jc w:val="center"/>
+            </w:pPr>
+            <w:r>
+              <w:rPr>
+                <w:sz w:val="24"/>
+                <w:szCs w:val="24"/>
+              </w:rPr>
+              <w:t>YOLOv8n</w:t>
+            </w:r>
+          </w:p>
+        </w:tc>
+        <w:tc>
+          <w:tcPr>
+            <w:tcW w:w="719" w:type="pct"/>
+            <w:vAlign w:val="center"/>
+          </w:tcPr>
+          <w:p>
+            <w:pPr>
+              <w:spacing w:line="276" w:lineRule="auto"/>
+              <w:ind w:firstLine="0"/>
+              <w:jc w:val="center"/>
+            </w:pPr>
+            <w:r>
+              <w:rPr>
+                <w:sz w:val="24"/>
+                <w:szCs w:val="24"/>
+              </w:rPr>
+              <w:t>0.912</w:t>
+            </w:r>
+          </w:p>
+        </w:tc>
+        <w:tc>
+          <w:tcPr>
+            <w:tcW w:w="1004" w:type="pct"/>
+            <w:vAlign w:val="center"/>
+          </w:tcPr>
+          <w:p>
+            <w:pPr>
+              <w:spacing w:line="276" w:lineRule="auto"/>
+              <w:ind w:firstLine="0"/>
+              <w:jc w:val="center"/>
+            </w:pPr>
+            <w:r>
+              <w:rPr>
+                <w:sz w:val="24"/>
+                <w:szCs w:val="24"/>
+              </w:rPr>
+              <w:t>0.523</w:t>
+            </w:r>
+          </w:p>
+        </w:tc>
+        <w:tc>
+          <w:tcPr>
+            <w:tcW w:w="664" w:type="pct"/>
+            <w:vAlign w:val="center"/>
+          </w:tcPr>
+          <w:p>
+            <w:pPr>
+              <w:spacing w:line="276" w:lineRule="auto"/>
+              <w:ind w:firstLine="0"/>
+              <w:jc w:val="center"/>
+            </w:pPr>
+            <w:r>
+              <w:rPr>
+                <w:sz w:val="24"/>
+                <w:szCs w:val="24"/>
+              </w:rPr>
+              <w:t>0.963</w:t>
+            </w:r>
+          </w:p>
+        </w:tc>
+        <w:tc>
+          <w:tcPr>
+            <w:tcW w:w="488" w:type="pct"/>
+            <w:vAlign w:val="center"/>
+          </w:tcPr>
+          <w:p>
+            <w:pPr>
+              <w:spacing w:line="276" w:lineRule="auto"/>
+              <w:ind w:firstLine="0"/>
+              <w:jc w:val="center"/>
+            </w:pPr>
+            <w:r>
+              <w:rPr>
+                <w:sz w:val="24"/>
+                <w:szCs w:val="24"/>
+              </w:rPr>
+              <w:t>0.837</w:t>
+            </w:r>
+          </w:p>
+        </w:tc>
+        <w:tc>
+          <w:tcPr>
+            <w:tcW w:w="598" w:type="pct"/>
+            <w:vAlign w:val="center"/>
+          </w:tcPr>
+          <w:p>
+            <w:pPr>
+              <w:spacing w:line="276" w:lineRule="auto"/>
+              <w:ind w:firstLine="0"/>
+              <w:jc w:val="center"/>
+            </w:pPr>
+            <w:r>
+              <w:rPr>
+                <w:sz w:val="24"/>
+                <w:szCs w:val="24"/>
+              </w:rPr>
+              <w:t>6.0 МБ</w:t>
+            </w:r>
+          </w:p>
+        </w:tc>
+        <w:tc>
+          <w:tcPr>
+            <w:tcW w:w="741" w:type="pct"/>
+          </w:tcPr>
+          <w:p>
+            <w:pPr>
+              <w:spacing w:line="276" w:lineRule="auto"/>
+              <w:ind w:firstLine="0"/>
+              <w:jc w:val="center"/>
+              <w:rPr>
+                <w:sz w:val="24"/>
+              </w:rPr>
+            </w:pPr>
+            <w:r>
+              <w:rPr>
+                <w:sz w:val="24"/>
+              </w:rPr>
+              <w:t>46.3 мс</w:t>
             </w:r>
           </w:p>
         </w:tc>
@@ -970,7 +1148,7 @@
         </w:trPr>
         <w:tc>
           <w:tcPr>
-            <w:tcW w:w="1743" w:type="dxa"/>
+            <w:tcW w:w="785" w:type="pct"/>
             <w:vAlign w:val="center"/>
           </w:tcPr>
           <w:p>
@@ -984,13 +1162,13 @@
                 <w:sz w:val="24"/>
                 <w:szCs w:val="24"/>
               </w:rPr>
-              <w:t>YOLOv8n</w:t>
+              <w:t>YOLOv8s</w:t>
             </w:r>
           </w:p>
         </w:tc>
         <w:tc>
           <w:tcPr>
-            <w:tcW w:w="1410" w:type="dxa"/>
+            <w:tcW w:w="719" w:type="pct"/>
             <w:vAlign w:val="center"/>
           </w:tcPr>
           <w:p>
@@ -1004,13 +1182,13 @@
                 <w:sz w:val="24"/>
                 <w:szCs w:val="24"/>
               </w:rPr>
-              <w:t>0.912</w:t>
+              <w:t>0.944</w:t>
             </w:r>
           </w:p>
         </w:tc>
         <w:tc>
           <w:tcPr>
-            <w:tcW w:w="1760" w:type="dxa"/>
+            <w:tcW w:w="1004" w:type="pct"/>
             <w:vAlign w:val="center"/>
           </w:tcPr>
           <w:p>
@@ -1024,13 +1202,13 @@
                 <w:sz w:val="24"/>
                 <w:szCs w:val="24"/>
               </w:rPr>
-              <w:t>0.523</w:t>
+              <w:t>0.544</w:t>
             </w:r>
           </w:p>
         </w:tc>
         <w:tc>
           <w:tcPr>
-            <w:tcW w:w="1374" w:type="dxa"/>
+            <w:tcW w:w="664" w:type="pct"/>
             <w:vAlign w:val="center"/>
           </w:tcPr>
           <w:p>
@@ -1044,13 +1222,13 @@
                 <w:sz w:val="24"/>
                 <w:szCs w:val="24"/>
               </w:rPr>
-              <w:t>0.963</w:t>
+              <w:t>0.966</w:t>
             </w:r>
           </w:p>
         </w:tc>
         <w:tc>
           <w:tcPr>
-            <w:tcW w:w="1197" w:type="dxa"/>
+            <w:tcW w:w="488" w:type="pct"/>
             <w:vAlign w:val="center"/>
           </w:tcPr>
           <w:p>
@@ -1064,13 +1242,13 @@
                 <w:sz w:val="24"/>
                 <w:szCs w:val="24"/>
               </w:rPr>
-              <w:t>0.837</w:t>
+              <w:t>0.905</w:t>
             </w:r>
           </w:p>
         </w:tc>
         <w:tc>
           <w:tcPr>
-            <w:tcW w:w="1303" w:type="dxa"/>
+            <w:tcW w:w="598" w:type="pct"/>
             <w:vAlign w:val="center"/>
           </w:tcPr>
           <w:p>
@@ -1084,7 +1262,28 @@
                 <w:sz w:val="24"/>
                 <w:szCs w:val="24"/>
               </w:rPr>
-              <w:t>6.0 МБ</w:t>
+              <w:t>21.5 МБ</w:t>
+            </w:r>
+          </w:p>
+        </w:tc>
+        <w:tc>
+          <w:tcPr>
+            <w:tcW w:w="741" w:type="pct"/>
+          </w:tcPr>
+          <w:p>
+            <w:pPr>
+              <w:spacing w:line="276" w:lineRule="auto"/>
+              <w:ind w:firstLine="0"/>
+              <w:jc w:val="center"/>
+              <w:rPr>
+                <w:sz w:val="24"/>
+              </w:rPr>
+            </w:pPr>
+            <w:r>
+              <w:rPr>
+                <w:sz w:val="24"/>
+              </w:rPr>
+              <w:t>51.1 мс</w:t>
             </w:r>
           </w:p>
         </w:tc>
@@ -1096,7 +1295,7 @@
         </w:trPr>
         <w:tc>
           <w:tcPr>
-            <w:tcW w:w="1743" w:type="dxa"/>
+            <w:tcW w:w="785" w:type="pct"/>
             <w:vAlign w:val="center"/>
           </w:tcPr>
           <w:p>
@@ -1110,13 +1309,13 @@
                 <w:sz w:val="24"/>
                 <w:szCs w:val="24"/>
               </w:rPr>
-              <w:t>YOLOv8s</w:t>
+              <w:t>YOLOv8m</w:t>
             </w:r>
           </w:p>
         </w:tc>
         <w:tc>
           <w:tcPr>
-            <w:tcW w:w="1410" w:type="dxa"/>
+            <w:tcW w:w="719" w:type="pct"/>
             <w:vAlign w:val="center"/>
           </w:tcPr>
           <w:p>
@@ -1130,13 +1329,13 @@
                 <w:sz w:val="24"/>
                 <w:szCs w:val="24"/>
               </w:rPr>
-              <w:t>0.944</w:t>
+              <w:t>0.957</w:t>
             </w:r>
           </w:p>
         </w:tc>
         <w:tc>
           <w:tcPr>
-            <w:tcW w:w="1760" w:type="dxa"/>
+            <w:tcW w:w="1004" w:type="pct"/>
             <w:vAlign w:val="center"/>
           </w:tcPr>
           <w:p>
@@ -1150,13 +1349,13 @@
                 <w:sz w:val="24"/>
                 <w:szCs w:val="24"/>
               </w:rPr>
-              <w:t>0.544</w:t>
+              <w:t>0.557</w:t>
             </w:r>
           </w:p>
         </w:tc>
         <w:tc>
           <w:tcPr>
-            <w:tcW w:w="1374" w:type="dxa"/>
+            <w:tcW w:w="664" w:type="pct"/>
             <w:vAlign w:val="center"/>
           </w:tcPr>
           <w:p>
@@ -1170,13 +1369,13 @@
                 <w:sz w:val="24"/>
                 <w:szCs w:val="24"/>
               </w:rPr>
-              <w:t>0.966</w:t>
+              <w:t>0.977</w:t>
             </w:r>
           </w:p>
         </w:tc>
         <w:tc>
           <w:tcPr>
-            <w:tcW w:w="1197" w:type="dxa"/>
+            <w:tcW w:w="488" w:type="pct"/>
             <w:vAlign w:val="center"/>
           </w:tcPr>
           <w:p>
@@ -1190,13 +1389,13 @@
                 <w:sz w:val="24"/>
                 <w:szCs w:val="24"/>
               </w:rPr>
-              <w:t>0.905</w:t>
+              <w:t>0.924</w:t>
             </w:r>
           </w:p>
         </w:tc>
         <w:tc>
           <w:tcPr>
-            <w:tcW w:w="1303" w:type="dxa"/>
+            <w:tcW w:w="598" w:type="pct"/>
             <w:vAlign w:val="center"/>
           </w:tcPr>
           <w:p>
@@ -1210,7 +1409,28 @@
                 <w:sz w:val="24"/>
                 <w:szCs w:val="24"/>
               </w:rPr>
-              <w:t>21.5 МБ</w:t>
+              <w:t>49.6 МБ</w:t>
+            </w:r>
+          </w:p>
+        </w:tc>
+        <w:tc>
+          <w:tcPr>
+            <w:tcW w:w="741" w:type="pct"/>
+          </w:tcPr>
+          <w:p>
+            <w:pPr>
+              <w:spacing w:line="276" w:lineRule="auto"/>
+              <w:ind w:firstLine="0"/>
+              <w:jc w:val="center"/>
+              <w:rPr>
+                <w:sz w:val="24"/>
+              </w:rPr>
+            </w:pPr>
+            <w:r>
+              <w:rPr>
+                <w:sz w:val="24"/>
+              </w:rPr>
+              <w:t>59.8 мс</w:t>
             </w:r>
           </w:p>
         </w:tc>
@@ -1222,7 +1442,7 @@
         </w:trPr>
         <w:tc>
           <w:tcPr>
-            <w:tcW w:w="1743" w:type="dxa"/>
+            <w:tcW w:w="785" w:type="pct"/>
             <w:vAlign w:val="center"/>
           </w:tcPr>
           <w:p>
@@ -1236,13 +1456,13 @@
                 <w:sz w:val="24"/>
                 <w:szCs w:val="24"/>
               </w:rPr>
-              <w:t>YOLOv8m</w:t>
+              <w:t>RT-DETR-l</w:t>
             </w:r>
           </w:p>
         </w:tc>
         <w:tc>
           <w:tcPr>
-            <w:tcW w:w="1410" w:type="dxa"/>
+            <w:tcW w:w="719" w:type="pct"/>
             <w:vAlign w:val="center"/>
           </w:tcPr>
           <w:p>
@@ -1256,13 +1476,13 @@
                 <w:sz w:val="24"/>
                 <w:szCs w:val="24"/>
               </w:rPr>
-              <w:t>0.957</w:t>
+              <w:t>0.953</w:t>
             </w:r>
           </w:p>
         </w:tc>
         <w:tc>
           <w:tcPr>
-            <w:tcW w:w="1760" w:type="dxa"/>
+            <w:tcW w:w="1004" w:type="pct"/>
             <w:vAlign w:val="center"/>
           </w:tcPr>
           <w:p>
@@ -1276,13 +1496,13 @@
                 <w:sz w:val="24"/>
                 <w:szCs w:val="24"/>
               </w:rPr>
-              <w:t>0.557</w:t>
+              <w:t>0.561</w:t>
             </w:r>
           </w:p>
         </w:tc>
         <w:tc>
           <w:tcPr>
-            <w:tcW w:w="1374" w:type="dxa"/>
+            <w:tcW w:w="664" w:type="pct"/>
             <w:vAlign w:val="center"/>
           </w:tcPr>
           <w:p>
@@ -1296,13 +1516,13 @@
                 <w:sz w:val="24"/>
                 <w:szCs w:val="24"/>
               </w:rPr>
-              <w:t>0.977</w:t>
+              <w:t>0.980</w:t>
             </w:r>
           </w:p>
         </w:tc>
         <w:tc>
           <w:tcPr>
-            <w:tcW w:w="1197" w:type="dxa"/>
+            <w:tcW w:w="488" w:type="pct"/>
             <w:vAlign w:val="center"/>
           </w:tcPr>
           <w:p>
@@ -1316,13 +1536,13 @@
                 <w:sz w:val="24"/>
                 <w:szCs w:val="24"/>
               </w:rPr>
-              <w:t>0.924</w:t>
+              <w:t>0.910</w:t>
             </w:r>
           </w:p>
         </w:tc>
         <w:tc>
           <w:tcPr>
-            <w:tcW w:w="1303" w:type="dxa"/>
+            <w:tcW w:w="598" w:type="pct"/>
             <w:vAlign w:val="center"/>
           </w:tcPr>
           <w:p>
@@ -1336,133 +1556,28 @@
                 <w:sz w:val="24"/>
                 <w:szCs w:val="24"/>
               </w:rPr>
-              <w:t>49.6 МБ</w:t>
+              <w:t>63.2 МБ</w:t>
             </w:r>
           </w:p>
         </w:tc>
-      </w:tr>
-      <w:tr>
-        <w:trPr>
-          <w:trHeight w:val="459"/>
-          <w:jc w:val="center"/>
-        </w:trPr>
         <w:tc>
           <w:tcPr>
-            <w:tcW w:w="1743" w:type="dxa"/>
-            <w:vAlign w:val="center"/>
+            <w:tcW w:w="741" w:type="pct"/>
           </w:tcPr>
           <w:p>
             <w:pPr>
               <w:spacing w:line="276" w:lineRule="auto"/>
               <w:ind w:firstLine="0"/>
               <w:jc w:val="center"/>
+              <w:rPr>
+                <w:sz w:val="24"/>
+              </w:rPr>
             </w:pPr>
             <w:r>
               <w:rPr>
                 <w:sz w:val="24"/>
-                <w:szCs w:val="24"/>
-              </w:rPr>
-              <w:t>RT-DETR-l</w:t>
-            </w:r>
-          </w:p>
-        </w:tc>
-        <w:tc>
-          <w:tcPr>
-            <w:tcW w:w="1410" w:type="dxa"/>
-            <w:vAlign w:val="center"/>
-          </w:tcPr>
-          <w:p>
-            <w:pPr>
-              <w:spacing w:line="276" w:lineRule="auto"/>
-              <w:ind w:firstLine="0"/>
-              <w:jc w:val="center"/>
-            </w:pPr>
-            <w:r>
-              <w:rPr>
-                <w:sz w:val="24"/>
-                <w:szCs w:val="24"/>
-              </w:rPr>
-              <w:t>0.953</w:t>
-            </w:r>
-          </w:p>
-        </w:tc>
-        <w:tc>
-          <w:tcPr>
-            <w:tcW w:w="1760" w:type="dxa"/>
-            <w:vAlign w:val="center"/>
-          </w:tcPr>
-          <w:p>
-            <w:pPr>
-              <w:spacing w:line="276" w:lineRule="auto"/>
-              <w:ind w:firstLine="0"/>
-              <w:jc w:val="center"/>
-            </w:pPr>
-            <w:r>
-              <w:rPr>
-                <w:sz w:val="24"/>
-                <w:szCs w:val="24"/>
-              </w:rPr>
-              <w:t>0.561</w:t>
-            </w:r>
-          </w:p>
-        </w:tc>
-        <w:tc>
-          <w:tcPr>
-            <w:tcW w:w="1374" w:type="dxa"/>
-            <w:vAlign w:val="center"/>
-          </w:tcPr>
-          <w:p>
-            <w:pPr>
-              <w:spacing w:line="276" w:lineRule="auto"/>
-              <w:ind w:firstLine="0"/>
-              <w:jc w:val="center"/>
-            </w:pPr>
-            <w:r>
-              <w:rPr>
-                <w:sz w:val="24"/>
-                <w:szCs w:val="24"/>
-              </w:rPr>
-              <w:t>0.980</w:t>
-            </w:r>
-          </w:p>
-        </w:tc>
-        <w:tc>
-          <w:tcPr>
-            <w:tcW w:w="1197" w:type="dxa"/>
-            <w:vAlign w:val="center"/>
-          </w:tcPr>
-          <w:p>
-            <w:pPr>
-              <w:spacing w:line="276" w:lineRule="auto"/>
-              <w:ind w:firstLine="0"/>
-              <w:jc w:val="center"/>
-            </w:pPr>
-            <w:r>
-              <w:rPr>
-                <w:sz w:val="24"/>
-                <w:szCs w:val="24"/>
-              </w:rPr>
-              <w:t>0.910</w:t>
-            </w:r>
-          </w:p>
-        </w:tc>
-        <w:tc>
-          <w:tcPr>
-            <w:tcW w:w="1303" w:type="dxa"/>
-            <w:vAlign w:val="center"/>
-          </w:tcPr>
-          <w:p>
-            <w:pPr>
-              <w:spacing w:line="276" w:lineRule="auto"/>
-              <w:ind w:firstLine="0"/>
-              <w:jc w:val="center"/>
-            </w:pPr>
-            <w:r>
-              <w:rPr>
-                <w:sz w:val="24"/>
-                <w:szCs w:val="24"/>
-              </w:rPr>
-              <w:t>63.2 МБ</w:t>
+              </w:rPr>
+              <w:t>78.8 мс</w:t>
             </w:r>
           </w:p>
         </w:tc>
@@ -1479,7 +1594,31 @@
       </w:r>
       <w:proofErr w:type="spellEnd"/>
       <w:r>
-        <w:t>. Вместе с тем RT-DETR-l значительно уступает по скорости (80.4 мс/изображение против 36.5 мс у YOLOv8s) и размеру модели (63.2 МБ против 21.5 МБ).</w:t>
+        <w:t>. Вместе с тем RT-DETR-l значительно уступает по скорости (</w:t>
+      </w:r>
+      <w:r>
+        <w:t>7</w:t>
+      </w:r>
+      <w:r>
+        <w:t>8.</w:t>
+      </w:r>
+      <w:r>
+        <w:t>8</w:t>
+      </w:r>
+      <w:r>
+        <w:t xml:space="preserve"> мс/изображение против </w:t>
+      </w:r>
+      <w:r>
+        <w:t>51</w:t>
+      </w:r>
+      <w:r>
+        <w:t>.</w:t>
+      </w:r>
+      <w:r>
+        <w:t>1</w:t>
+      </w:r>
+      <w:r>
+        <w:t xml:space="preserve"> мс у YOLOv8s) и размеру модели (63.2 МБ против 21.5 МБ).</w:t>
       </w:r>
     </w:p>
     <w:p>
@@ -1511,10 +1650,10 @@
           <w:noProof/>
         </w:rPr>
         <w:drawing>
-          <wp:inline distT="0" distB="0" distL="0" distR="0" wp14:anchorId="4BC10610" wp14:editId="76B4A19C">
-            <wp:extent cx="6120130" cy="1300480"/>
+          <wp:inline distT="0" distB="0" distL="0" distR="0" wp14:anchorId="75852181" wp14:editId="5F13A921">
+            <wp:extent cx="6120130" cy="1301115"/>
             <wp:effectExtent l="0" t="0" r="0" b="0"/>
-            <wp:docPr id="1717321709" name="Picture 1"/>
+            <wp:docPr id="1501389136" name="Picture 1"/>
             <wp:cNvGraphicFramePr>
               <a:graphicFrameLocks xmlns:a="http://schemas.openxmlformats.org/drawingml/2006/main" noChangeAspect="1"/>
             </wp:cNvGraphicFramePr>
@@ -1522,17 +1661,11 @@
               <a:graphicData uri="http://schemas.openxmlformats.org/drawingml/2006/picture">
                 <pic:pic xmlns:pic="http://schemas.openxmlformats.org/drawingml/2006/picture">
                   <pic:nvPicPr>
-                    <pic:cNvPr id="1717321709" name="Picture 1717321709"/>
+                    <pic:cNvPr id="1501389136" name=""/>
                     <pic:cNvPicPr/>
                   </pic:nvPicPr>
                   <pic:blipFill>
-                    <a:blip r:embed="rId6" cstate="print">
-                      <a:extLst>
-                        <a:ext uri="{28A0092B-C50C-407E-A947-70E740481C1C}">
-                          <a14:useLocalDpi xmlns:a14="http://schemas.microsoft.com/office/drawing/2010/main" val="0"/>
-                        </a:ext>
-                      </a:extLst>
-                    </a:blip>
+                    <a:blip r:embed="rId6"/>
                     <a:stretch>
                       <a:fillRect/>
                     </a:stretch>
@@ -1540,7 +1673,7 @@
                   <pic:spPr>
                     <a:xfrm>
                       <a:off x="0" y="0"/>
-                      <a:ext cx="6120130" cy="1300480"/>
+                      <a:ext cx="6120130" cy="1301115"/>
                     </a:xfrm>
                     <a:prstGeom prst="rect">
                       <a:avLst/>
@@ -1642,10 +1775,10 @@
         </w:rPr>
         <w:lastRenderedPageBreak/>
         <w:drawing>
-          <wp:inline distT="0" distB="0" distL="0" distR="0" wp14:anchorId="19092337" wp14:editId="4FEFEF70">
-            <wp:extent cx="5779699" cy="2871259"/>
-            <wp:effectExtent l="0" t="0" r="0" b="5715"/>
-            <wp:docPr id="1133309156" name="Picture 5"/>
+          <wp:inline distT="0" distB="0" distL="0" distR="0" wp14:anchorId="5594E604" wp14:editId="0C4F64A4">
+            <wp:extent cx="6120130" cy="2639060"/>
+            <wp:effectExtent l="0" t="0" r="0" b="8890"/>
+            <wp:docPr id="440557030" name="Picture 6"/>
             <wp:cNvGraphicFramePr>
               <a:graphicFrameLocks xmlns:a="http://schemas.openxmlformats.org/drawingml/2006/main" noChangeAspect="1"/>
             </wp:cNvGraphicFramePr>
@@ -1653,7 +1786,7 @@
               <a:graphicData uri="http://schemas.openxmlformats.org/drawingml/2006/picture">
                 <pic:pic xmlns:pic="http://schemas.openxmlformats.org/drawingml/2006/picture">
                   <pic:nvPicPr>
-                    <pic:cNvPr id="1133309156" name="Picture 1133309156"/>
+                    <pic:cNvPr id="440557030" name="Picture 440557030"/>
                     <pic:cNvPicPr/>
                   </pic:nvPicPr>
                   <pic:blipFill>
@@ -1671,7 +1804,7 @@
                   <pic:spPr>
                     <a:xfrm>
                       <a:off x="0" y="0"/>
-                      <a:ext cx="5792095" cy="2877417"/>
+                      <a:ext cx="6120130" cy="2639060"/>
                     </a:xfrm>
                     <a:prstGeom prst="rect">
                       <a:avLst/>
@@ -1698,13 +1831,8 @@
       <w:r>
         <w:t xml:space="preserve"> </w:t>
       </w:r>
-      <w:proofErr w:type="gramStart"/>
-      <w:r>
-        <w:t>Пример верно</w:t>
-      </w:r>
-      <w:proofErr w:type="gramEnd"/>
-      <w:r>
-        <w:t xml:space="preserve"> обнаруженных дефектов моделью YOLOv8m для класса </w:t>
+      <w:r>
+        <w:t xml:space="preserve">Пример верно обнаруженных дефектов моделью YOLOv8m для класса </w:t>
       </w:r>
       <w:proofErr w:type="spellStart"/>
       <w:r>
@@ -1778,10 +1906,10 @@
           <w:noProof/>
         </w:rPr>
         <w:drawing>
-          <wp:inline distT="0" distB="0" distL="0" distR="0" wp14:anchorId="29D1A25F" wp14:editId="18D574D6">
-            <wp:extent cx="5581291" cy="2506890"/>
-            <wp:effectExtent l="0" t="0" r="635" b="8255"/>
-            <wp:docPr id="1140188442" name="Picture 4"/>
+          <wp:inline distT="0" distB="0" distL="0" distR="0" wp14:anchorId="6702DE60" wp14:editId="21EAD032">
+            <wp:extent cx="6120130" cy="2704465"/>
+            <wp:effectExtent l="0" t="0" r="0" b="635"/>
+            <wp:docPr id="1515679937" name="Picture 1"/>
             <wp:cNvGraphicFramePr>
               <a:graphicFrameLocks xmlns:a="http://schemas.openxmlformats.org/drawingml/2006/main" noChangeAspect="1"/>
             </wp:cNvGraphicFramePr>
@@ -1789,17 +1917,11 @@
               <a:graphicData uri="http://schemas.openxmlformats.org/drawingml/2006/picture">
                 <pic:pic xmlns:pic="http://schemas.openxmlformats.org/drawingml/2006/picture">
                   <pic:nvPicPr>
-                    <pic:cNvPr id="1140188442" name="Picture 1140188442"/>
+                    <pic:cNvPr id="1515679937" name=""/>
                     <pic:cNvPicPr/>
                   </pic:nvPicPr>
                   <pic:blipFill>
-                    <a:blip r:embed="rId8" cstate="print">
-                      <a:extLst>
-                        <a:ext uri="{28A0092B-C50C-407E-A947-70E740481C1C}">
-                          <a14:useLocalDpi xmlns:a14="http://schemas.microsoft.com/office/drawing/2010/main" val="0"/>
-                        </a:ext>
-                      </a:extLst>
-                    </a:blip>
+                    <a:blip r:embed="rId8"/>
                     <a:stretch>
                       <a:fillRect/>
                     </a:stretch>
@@ -1807,7 +1929,7 @@
                   <pic:spPr>
                     <a:xfrm>
                       <a:off x="0" y="0"/>
-                      <a:ext cx="5602624" cy="2516472"/>
+                      <a:ext cx="6120130" cy="2704465"/>
                     </a:xfrm>
                     <a:prstGeom prst="rect">
                       <a:avLst/>
@@ -1887,7 +2009,37 @@
     </w:p>
     <w:p>
       <w:r>
-        <w:t xml:space="preserve">Экспериментально установлено: (1) YOLOv8m обеспечивает наилучший mAP@0.5 = 0.957; (2) RT-DETR-l превосходит по точной локализации — mAP@0.5:0.95 = 0.561, однако в 2.2 раза медленнее; (3) YOLOv8s является оптимальным выбором для промышленных AOI-систем с учётом баланса точности (mAP@0.5 = 0.944), скорости (36.5 мс/изображение) и компактности модели (21.5 МБ); (4) класс </w:t>
+        <w:t xml:space="preserve">Экспериментально установлено: (1) YOLOv8m обеспечивает наилучший mAP@0.5 = 0.957; (2) RT-DETR-l превосходит по точной локализации — mAP@0.5:0.95 = 0.561, однако в </w:t>
+      </w:r>
+      <w:r>
+        <w:t>1</w:t>
+      </w:r>
+      <w:r>
+        <w:t>.</w:t>
+      </w:r>
+      <w:r>
+        <w:t>3</w:t>
+      </w:r>
+      <w:r>
+        <w:t xml:space="preserve"> раза медленнее</w:t>
+      </w:r>
+      <w:r>
+        <w:t xml:space="preserve"> YOLOv8m</w:t>
+      </w:r>
+      <w:r>
+        <w:t>; (3) YOLOv8s является оптимальным выбором для промышленных AOI-систем с учётом баланса точности (mAP@0.5 = 0.944), скорости (</w:t>
+      </w:r>
+      <w:r>
+        <w:t>51</w:t>
+      </w:r>
+      <w:r>
+        <w:t>.</w:t>
+      </w:r>
+      <w:r>
+        <w:t>1</w:t>
+      </w:r>
+      <w:r>
+        <w:t xml:space="preserve"> мс/изображение) и компактности модели (21.5 МБ); (4) класс </w:t>
       </w:r>
       <w:proofErr w:type="spellStart"/>
       <w:r>
@@ -1895,7 +2047,11 @@
       </w:r>
       <w:proofErr w:type="spellEnd"/>
       <w:r>
-        <w:t xml:space="preserve"> остаётся наиболее трудным для всех архитектур [5]. Направлениями дальнейших исследований являются применение входного разрешения 1280×1280 для улучшения детекции мелких дефектов, а также тестирование на реальных производственных данных с более широким спектром типов дефектов.</w:t>
+        <w:t xml:space="preserve"> остаётся наиболее трудным для всех архитектур [5]. Направлениями дальнейших исследований являются применение входного </w:t>
+      </w:r>
+      <w:r>
+        <w:lastRenderedPageBreak/>
+        <w:t>разрешения 1280×1280 для улучшения детекции мелких дефектов, а также тестирование на реальных производственных данных с более широким спектром типов дефектов.</w:t>
       </w:r>
     </w:p>
     <w:p>
@@ -1903,7 +2059,6 @@
         <w:pStyle w:val="Caption"/>
       </w:pPr>
       <w:r>
-        <w:lastRenderedPageBreak/>
         <w:t>Литература</w:t>
       </w:r>
     </w:p>

</xml_diff>

<commit_message>
Fix: paper restructed, more conclusions were added
</commit_message>
<xml_diff>
--- a/paper/Квардонов_Толкачев_PCB_defect_detection.docx
+++ b/paper/Квардонов_Толкачев_PCB_defect_detection.docx
@@ -385,13 +385,28 @@
       </w:r>
       <w:proofErr w:type="spellEnd"/>
       <w:r>
-        <w:t xml:space="preserve"> за счёт механизма внимания. Вместе с тем их вычислительная сложность может ограничивать применение в высокопроизводительных линиях. Существующие работы по детекции дефектов </w:t>
-      </w:r>
-      <w:r>
-        <w:t>печатных плат</w:t>
-      </w:r>
-      <w:r>
-        <w:t xml:space="preserve">, как правило, ограничены одной архитектурой: в [4] использован специализированный детектор на базе VGG16, в [1] — </w:t>
+        <w:t xml:space="preserve"> за счёт механизма внимания. Вместе с тем их вычислительная сложность может ограничивать применение в высокопроизводительных линиях. Применение DETR-подобных архитектур к дефектоскопии печатных плат рассматривалось в ряде работ [</w:t>
+      </w:r>
+      <w:r>
+        <w:t>4</w:t>
+      </w:r>
+      <w:r>
+        <w:t>], однако в них, как правило, исследуется одна модифицированная архитектура без прямого сравнения с семейством YOLOv8 в идентичных условиях обучения. В более ранних работах применялись одиночные архитектуры: в [</w:t>
+      </w:r>
+      <w:r>
+        <w:t>5</w:t>
+      </w:r>
+      <w:r>
+        <w:t>]</w:t>
+      </w:r>
+      <w:r>
+        <w:t xml:space="preserve"> описывается </w:t>
+      </w:r>
+      <w:r>
+        <w:t xml:space="preserve">детектор на базе VGG16, в [1] </w:t>
+      </w:r>
+      <w:r>
+        <w:t xml:space="preserve">упоминается </w:t>
       </w:r>
       <w:proofErr w:type="spellStart"/>
       <w:r>
@@ -399,20 +414,41 @@
       </w:r>
       <w:proofErr w:type="spellEnd"/>
       <w:r>
-        <w:t xml:space="preserve"> R-CNN, тогда как сравнение современных однопроходных детекторов (YOLOv8) с </w:t>
-      </w:r>
-      <w:proofErr w:type="spellStart"/>
-      <w:r>
-        <w:t>трансформерными</w:t>
-      </w:r>
-      <w:proofErr w:type="spellEnd"/>
-      <w:r>
-        <w:t xml:space="preserve"> (RT-DETR) на данном классе задач в литературе не проводилось.</w:t>
-      </w:r>
-    </w:p>
-    <w:p>
-      <w:r>
-        <w:t xml:space="preserve">Цель настоящей работы — провести сравнительное исследование четырёх архитектур детекторов (YOLOv8n, YOLOv8s, YOLOv8m, RT-DETR-l) применительно к задаче автоматизированного обнаружения дефектов поверхности печатных плат (PCB, </w:t>
+        <w:t xml:space="preserve"> R-CNN. Прямое сравнение четырёх конфигураций (YOLOv8n/s/m и RT-DETR-l) на датасете </w:t>
+      </w:r>
+      <w:proofErr w:type="spellStart"/>
+      <w:r>
+        <w:t>DeepPCB</w:t>
+      </w:r>
+      <w:proofErr w:type="spellEnd"/>
+      <w:r>
+        <w:t xml:space="preserve"> при единых </w:t>
+      </w:r>
+      <w:proofErr w:type="spellStart"/>
+      <w:r>
+        <w:t>гиперпараметрах</w:t>
+      </w:r>
+      <w:proofErr w:type="spellEnd"/>
+      <w:r>
+        <w:t xml:space="preserve"> обучения ранее не проводилось.</w:t>
+      </w:r>
+    </w:p>
+    <w:p>
+      <w:r>
+        <w:t xml:space="preserve">Цель настоящей работы </w:t>
+      </w:r>
+      <w:r>
+        <w:t>–</w:t>
+      </w:r>
+      <w:r>
+        <w:t xml:space="preserve"> </w:t>
+      </w:r>
+      <w:r>
+        <w:t>провести сравнительное исследование четырёх архитектур детекторов (YOLOv8n, YOLOv8s, YOLOv8m, RT-DETR-l) применительно к задаче автоматизированного обнаружения дефектов поверхности печат</w:t>
+      </w:r>
+      <w:r>
+        <w:lastRenderedPageBreak/>
+        <w:t xml:space="preserve">ных плат (PCB, </w:t>
       </w:r>
       <w:proofErr w:type="spellStart"/>
       <w:r>
@@ -445,7 +481,6 @@
           <w:b/>
           <w:bCs/>
         </w:rPr>
-        <w:lastRenderedPageBreak/>
         <w:t xml:space="preserve">1. Набор данных и предобработка. </w:t>
       </w:r>
       <w:r>
@@ -457,7 +492,13 @@
       </w:r>
       <w:proofErr w:type="spellEnd"/>
       <w:r>
-        <w:t xml:space="preserve"> (PKU-Market-PCB) [4], разработанный Пекинским университетом. Датасет содержит 693 изображения печатных плат с аннотациями шести типов дефектов: </w:t>
+        <w:t xml:space="preserve"> (PKU-Market-PCB) [</w:t>
+      </w:r>
+      <w:r>
+        <w:t>5</w:t>
+      </w:r>
+      <w:r>
+        <w:t xml:space="preserve">], разработанный Пекинским университетом. Датасет содержит 693 изображения печатных плат с аннотациями шести типов дефектов: </w:t>
       </w:r>
       <w:proofErr w:type="spellStart"/>
       <w:r>
@@ -526,7 +567,13 @@
       </w:r>
       <w:proofErr w:type="spellEnd"/>
       <w:r>
-        <w:t xml:space="preserve"> составляет 0.0004–0.0013 в зависимости от класса, что делает задачу сложной для стандартных детекторов, ориентированных на объекты среднего размера. Для подготовки к обучению аннотации </w:t>
+        <w:t xml:space="preserve"> составляет 0.0004</w:t>
+      </w:r>
+      <w:r>
+        <w:t>-</w:t>
+      </w:r>
+      <w:r>
+        <w:t xml:space="preserve">0.0013 в зависимости от класса, что делает задачу сложной для стандартных детекторов, ориентированных на объекты среднего размера. Для подготовки к обучению аннотации </w:t>
       </w:r>
       <w:proofErr w:type="spellStart"/>
       <w:r>
@@ -583,9 +630,9 @@
           <w:lang w:val="en-US"/>
         </w:rPr>
         <w:drawing>
-          <wp:inline distT="0" distB="0" distL="0" distR="0" wp14:anchorId="5814C80B" wp14:editId="0201B652">
-            <wp:extent cx="6120130" cy="4868545"/>
-            <wp:effectExtent l="0" t="0" r="0" b="8255"/>
+          <wp:inline distT="0" distB="0" distL="0" distR="0" wp14:anchorId="5814C80B" wp14:editId="0B90E8C8">
+            <wp:extent cx="5855114" cy="4657725"/>
+            <wp:effectExtent l="0" t="0" r="0" b="0"/>
             <wp:docPr id="462532011" name="Picture 4"/>
             <wp:cNvGraphicFramePr>
               <a:graphicFrameLocks xmlns:a="http://schemas.openxmlformats.org/drawingml/2006/main" noChangeAspect="1"/>
@@ -612,7 +659,7 @@
                   <pic:spPr>
                     <a:xfrm>
                       <a:off x="0" y="0"/>
-                      <a:ext cx="6120130" cy="4868545"/>
+                      <a:ext cx="5865876" cy="4666286"/>
                     </a:xfrm>
                     <a:prstGeom prst="rect">
                       <a:avLst/>
@@ -685,13 +732,31 @@
       </w:r>
       <w:proofErr w:type="spellEnd"/>
       <w:r>
-        <w:t xml:space="preserve"> </w:t>
-      </w:r>
-      <w:r>
-        <w:t>32</w:t>
-      </w:r>
-      <w:r>
-        <w:t>. Применялась аугментация: мозаичное смешивание (</w:t>
+        <w:t xml:space="preserve"> 32. Оптимизатор </w:t>
+      </w:r>
+      <w:proofErr w:type="spellStart"/>
+      <w:r>
+        <w:t>AdamW</w:t>
+      </w:r>
+      <w:proofErr w:type="spellEnd"/>
+      <w:r>
+        <w:t xml:space="preserve"> (значения по умолчанию </w:t>
+      </w:r>
+      <w:proofErr w:type="spellStart"/>
+      <w:r>
+        <w:t>Ultralytics</w:t>
+      </w:r>
+      <w:proofErr w:type="spellEnd"/>
+      <w:r>
+        <w:t xml:space="preserve">); </w:t>
+      </w:r>
+      <w:proofErr w:type="spellStart"/>
+      <w:r>
+        <w:t>weight_decay</w:t>
+      </w:r>
+      <w:proofErr w:type="spellEnd"/>
+      <w:r>
+        <w:t>=0.0005. Применялась аугментация: мозаичное смешивание (</w:t>
       </w:r>
       <w:proofErr w:type="spellStart"/>
       <w:r>
@@ -699,19 +764,7 @@
       </w:r>
       <w:proofErr w:type="spellEnd"/>
       <w:r>
-        <w:t>=</w:t>
-      </w:r>
-      <w:r>
-        <w:t>0</w:t>
-      </w:r>
-      <w:r>
-        <w:t>.</w:t>
-      </w:r>
-      <w:r>
-        <w:t>5</w:t>
-      </w:r>
-      <w:r>
-        <w:t>), горизонтальное зеркалирование (</w:t>
+        <w:t>=0.5), горизонтальное зеркалирование (</w:t>
       </w:r>
       <w:proofErr w:type="spellStart"/>
       <w:r>
@@ -719,7 +772,31 @@
       </w:r>
       <w:proofErr w:type="spellEnd"/>
       <w:r>
-        <w:t xml:space="preserve">=0.5), случайное изменение параметров HSV. Обучение выполнено на GPU NVIDIA GeForce RTX 3060 (12 ГБ VRAM) с использованием библиотеки </w:t>
+        <w:t>=0.5), случайное изменение HSV (</w:t>
+      </w:r>
+      <w:proofErr w:type="spellStart"/>
+      <w:r>
+        <w:t>hsv_h</w:t>
+      </w:r>
+      <w:proofErr w:type="spellEnd"/>
+      <w:r>
+        <w:t xml:space="preserve">=0.015, </w:t>
+      </w:r>
+      <w:proofErr w:type="spellStart"/>
+      <w:r>
+        <w:t>hsv_s</w:t>
+      </w:r>
+      <w:proofErr w:type="spellEnd"/>
+      <w:r>
+        <w:t xml:space="preserve">=0.5, </w:t>
+      </w:r>
+      <w:proofErr w:type="spellStart"/>
+      <w:r>
+        <w:t>hsv_v</w:t>
+      </w:r>
+      <w:proofErr w:type="spellEnd"/>
+      <w:r>
+        <w:t xml:space="preserve">=0.4). Обучение выполнено на GPU NVIDIA GeForce RTX 3060 (12 ГБ VRAM) с использованием библиотеки </w:t>
       </w:r>
       <w:proofErr w:type="spellStart"/>
       <w:r>
@@ -748,7 +825,15 @@
       </w:r>
       <w:proofErr w:type="spellEnd"/>
       <w:r>
-        <w:t xml:space="preserve"> при пороге достоверности 0.25 и </w:t>
+        <w:t xml:space="preserve"> при пороге достоверности </w:t>
+      </w:r>
+      <w:proofErr w:type="spellStart"/>
+      <w:r>
+        <w:t>conf</w:t>
+      </w:r>
+      <w:proofErr w:type="spellEnd"/>
+      <w:r>
+        <w:t xml:space="preserve">=0.25 и </w:t>
       </w:r>
       <w:proofErr w:type="spellStart"/>
       <w:r>
@@ -756,7 +841,29 @@
       </w:r>
       <w:proofErr w:type="spellEnd"/>
       <w:r>
-        <w:t xml:space="preserve">=0.5. Скорость </w:t>
+        <w:t xml:space="preserve">=0.5. Пониженный порог </w:t>
+      </w:r>
+      <w:proofErr w:type="spellStart"/>
+      <w:r>
+        <w:t>conf</w:t>
+      </w:r>
+      <w:proofErr w:type="spellEnd"/>
+      <w:r>
+        <w:t xml:space="preserve">=0.25 обоснован малой нормализованной площадью </w:t>
+      </w:r>
+      <w:proofErr w:type="spellStart"/>
+      <w:r>
+        <w:t>bbox</w:t>
+      </w:r>
+      <w:proofErr w:type="spellEnd"/>
+      <w:r>
+        <w:t xml:space="preserve"> (0.0004</w:t>
+      </w:r>
+      <w:r>
+        <w:t>-</w:t>
+      </w:r>
+      <w:r>
+        <w:t xml:space="preserve">0.0013): при стандартном пороге 0.5 модели систематически занижают уверенность для мелких объектов, что приводит к избыточным ложноотрицательным срабатываниям. Скорость </w:t>
       </w:r>
       <w:proofErr w:type="spellStart"/>
       <w:r>
@@ -764,7 +871,44 @@
       </w:r>
       <w:proofErr w:type="spellEnd"/>
       <w:r>
-        <w:t xml:space="preserve"> измерялась как среднее время обработки одного изображения (мс/изображение) на GPU с предварительным прогревом.</w:t>
+        <w:t xml:space="preserve"> определялась усреднением по 10 тестовым изображениям (</w:t>
+      </w:r>
+      <w:proofErr w:type="spellStart"/>
+      <w:r>
+        <w:t>batch</w:t>
+      </w:r>
+      <w:proofErr w:type="spellEnd"/>
+      <w:r>
+        <w:t xml:space="preserve">=1) после однократного прогрева с помощью </w:t>
+      </w:r>
+      <w:proofErr w:type="spellStart"/>
+      <w:proofErr w:type="gramStart"/>
+      <w:r>
+        <w:t>time.perf</w:t>
+      </w:r>
+      <w:proofErr w:type="gramEnd"/>
+      <w:r>
+        <w:t>_counter</w:t>
+      </w:r>
+      <w:proofErr w:type="spellEnd"/>
+      <w:r>
+        <w:t xml:space="preserve">; значения отражают сквозную латентность </w:t>
+      </w:r>
+      <w:proofErr w:type="spellStart"/>
+      <w:r>
+        <w:t>пайплайна</w:t>
+      </w:r>
+      <w:proofErr w:type="spellEnd"/>
+      <w:r>
+        <w:t xml:space="preserve"> (предобработка + </w:t>
+      </w:r>
+      <w:proofErr w:type="spellStart"/>
+      <w:r>
+        <w:t>инференс</w:t>
+      </w:r>
+      <w:proofErr w:type="spellEnd"/>
+      <w:r>
+        <w:t xml:space="preserve"> + постобработка) в Python-приложении на GPU.</w:t>
       </w:r>
     </w:p>
     <w:p>
@@ -1594,31 +1738,72 @@
       </w:r>
       <w:proofErr w:type="spellEnd"/>
       <w:r>
-        <w:t>. Вместе с тем RT-DETR-l значительно уступает по скорости (</w:t>
-      </w:r>
-      <w:r>
-        <w:t>7</w:t>
-      </w:r>
-      <w:r>
-        <w:t>8.</w:t>
-      </w:r>
-      <w:r>
-        <w:t>8</w:t>
-      </w:r>
-      <w:r>
-        <w:t xml:space="preserve"> мс/изображение против </w:t>
-      </w:r>
-      <w:r>
-        <w:t>51</w:t>
-      </w:r>
-      <w:r>
-        <w:t>.</w:t>
-      </w:r>
-      <w:r>
-        <w:t>1</w:t>
-      </w:r>
-      <w:r>
-        <w:t xml:space="preserve"> мс у YOLOv8s) и размеру модели (63.2 МБ против 21.5 МБ).</w:t>
+        <w:t xml:space="preserve">. Вместе с тем RT-DETR-l значительно уступает по скорости (78.8 мс/изображение против 51.1 мс у YOLOv8s) и размеру модели (63.2 МБ против 21.5 МБ). Приоритет метрики определяется требованиями конкретного производства: mAP@0.5 </w:t>
+      </w:r>
+      <w:r>
+        <w:t xml:space="preserve">подойдет </w:t>
+      </w:r>
+      <w:r>
+        <w:t xml:space="preserve">для систем с допустимой погрешностью локализации, </w:t>
+      </w:r>
+      <w:r>
+        <w:t xml:space="preserve">а </w:t>
+      </w:r>
+      <w:r>
+        <w:t xml:space="preserve">mAP@0.5:0.95 </w:t>
+      </w:r>
+      <w:r>
+        <w:t>–</w:t>
+      </w:r>
+      <w:r>
+        <w:t xml:space="preserve"> </w:t>
+      </w:r>
+      <w:r>
+        <w:t>для прецизионного контроля.</w:t>
+      </w:r>
+      <w:r>
+        <w:t xml:space="preserve"> </w:t>
+      </w:r>
+      <w:r>
+        <w:t xml:space="preserve">Для обоснования выбора YOLOv8s рассчитан показатель предельной эффективности: прирост </w:t>
+      </w:r>
+      <w:proofErr w:type="spellStart"/>
+      <w:r>
+        <w:t>mAP</w:t>
+      </w:r>
+      <w:proofErr w:type="spellEnd"/>
+      <w:r>
+        <w:t xml:space="preserve"> при переходе YOLOv8n→s составляет +0.032 при увеличении размера на 15.5 МБ (2.1×10⁻³ </w:t>
+      </w:r>
+      <w:proofErr w:type="spellStart"/>
+      <w:r>
+        <w:t>mAP</w:t>
+      </w:r>
+      <w:proofErr w:type="spellEnd"/>
+      <w:r>
+        <w:t xml:space="preserve">/МБ), тогда как переход </w:t>
+      </w:r>
+      <w:proofErr w:type="spellStart"/>
+      <w:r>
+        <w:t>s→m</w:t>
+      </w:r>
+      <w:proofErr w:type="spellEnd"/>
+      <w:r>
+        <w:t xml:space="preserve"> даёт лишь +0.013 при +28.1 МБ (0.46×10⁻³ </w:t>
+      </w:r>
+      <w:proofErr w:type="spellStart"/>
+      <w:r>
+        <w:t>mAP</w:t>
+      </w:r>
+      <w:proofErr w:type="spellEnd"/>
+      <w:r>
+        <w:t>/МБ)</w:t>
+      </w:r>
+      <w:r>
+        <w:t xml:space="preserve">, наблюдается </w:t>
+      </w:r>
+      <w:r>
+        <w:t>снижение эффективности в 4.5 раза.</w:t>
       </w:r>
     </w:p>
     <w:p>
@@ -1649,6 +1834,7 @@
         <w:rPr>
           <w:noProof/>
         </w:rPr>
+        <w:lastRenderedPageBreak/>
         <w:drawing>
           <wp:inline distT="0" distB="0" distL="0" distR="0" wp14:anchorId="75852181" wp14:editId="5F13A921">
             <wp:extent cx="6120130" cy="1301115"/>
@@ -1714,6 +1900,46 @@
         </w:rPr>
       </w:pPr>
       <w:r>
+        <w:t>Анализ AP@0.5 по классам (рис. 2) выявляет, что наиболее сложными для всех архитектур являются разрыв цепи (</w:t>
+      </w:r>
+      <w:proofErr w:type="spellStart"/>
+      <w:r>
+        <w:t>open_circuit</w:t>
+      </w:r>
+      <w:proofErr w:type="spellEnd"/>
+      <w:r>
+        <w:t>, среднее AP = 0.921) и лишняя медь (</w:t>
+      </w:r>
+      <w:proofErr w:type="spellStart"/>
+      <w:r>
+        <w:t>spurious_copper</w:t>
+      </w:r>
+      <w:proofErr w:type="spellEnd"/>
+      <w:r>
+        <w:t>, среднее AP = 0.914)</w:t>
+      </w:r>
+      <w:r>
+        <w:t xml:space="preserve">. Эти классы представляют </w:t>
+      </w:r>
+      <w:r>
+        <w:t xml:space="preserve">дефекты с нечёткими текстурными границами и переменной формой. Наиболее точно обнаруживается пропущенное отверстие (среднее AP = 0.975): его геометрия хорошо описывается </w:t>
+      </w:r>
+      <w:proofErr w:type="spellStart"/>
+      <w:r>
+        <w:t>bbox</w:t>
+      </w:r>
+      <w:proofErr w:type="spellEnd"/>
+      <w:r>
+        <w:t>.</w:t>
+      </w:r>
+    </w:p>
+    <w:p>
+      <w:pPr>
+        <w:rPr>
+          <w:noProof/>
+        </w:rPr>
+      </w:pPr>
+      <w:r>
         <w:rPr>
           <w:noProof/>
         </w:rPr>
@@ -1773,11 +1999,10 @@
           <w:noProof/>
           <w:szCs w:val="28"/>
         </w:rPr>
-        <w:lastRenderedPageBreak/>
         <w:drawing>
-          <wp:inline distT="0" distB="0" distL="0" distR="0" wp14:anchorId="5594E604" wp14:editId="0C4F64A4">
-            <wp:extent cx="6120130" cy="2639060"/>
-            <wp:effectExtent l="0" t="0" r="0" b="8890"/>
+          <wp:inline distT="0" distB="0" distL="0" distR="0" wp14:anchorId="5594E604" wp14:editId="4DD2C5BE">
+            <wp:extent cx="5986122" cy="2581275"/>
+            <wp:effectExtent l="0" t="0" r="0" b="0"/>
             <wp:docPr id="440557030" name="Picture 6"/>
             <wp:cNvGraphicFramePr>
               <a:graphicFrameLocks xmlns:a="http://schemas.openxmlformats.org/drawingml/2006/main" noChangeAspect="1"/>
@@ -1804,7 +2029,7 @@
                   <pic:spPr>
                     <a:xfrm>
                       <a:off x="0" y="0"/>
-                      <a:ext cx="6120130" cy="2639060"/>
+                      <a:ext cx="6003835" cy="2588913"/>
                     </a:xfrm>
                     <a:prstGeom prst="rect">
                       <a:avLst/>
@@ -1831,8 +2056,13 @@
       <w:r>
         <w:t xml:space="preserve"> </w:t>
       </w:r>
-      <w:r>
-        <w:t xml:space="preserve">Пример верно обнаруженных дефектов моделью YOLOv8m для класса </w:t>
+      <w:proofErr w:type="gramStart"/>
+      <w:r>
+        <w:t>Пример верно</w:t>
+      </w:r>
+      <w:proofErr w:type="gramEnd"/>
+      <w:r>
+        <w:t xml:space="preserve"> обнаруженных дефектов моделью YOLOv8m для класса </w:t>
       </w:r>
       <w:proofErr w:type="spellStart"/>
       <w:r>
@@ -1906,9 +2136,9 @@
           <w:noProof/>
         </w:rPr>
         <w:drawing>
-          <wp:inline distT="0" distB="0" distL="0" distR="0" wp14:anchorId="6702DE60" wp14:editId="21EAD032">
-            <wp:extent cx="6120130" cy="2704465"/>
-            <wp:effectExtent l="0" t="0" r="0" b="635"/>
+          <wp:inline distT="0" distB="0" distL="0" distR="0" wp14:anchorId="6702DE60" wp14:editId="2AEB0763">
+            <wp:extent cx="5561144" cy="2457450"/>
+            <wp:effectExtent l="0" t="0" r="1905" b="0"/>
             <wp:docPr id="1515679937" name="Picture 1"/>
             <wp:cNvGraphicFramePr>
               <a:graphicFrameLocks xmlns:a="http://schemas.openxmlformats.org/drawingml/2006/main" noChangeAspect="1"/>
@@ -1929,7 +2159,7 @@
                   <pic:spPr>
                     <a:xfrm>
                       <a:off x="0" y="0"/>
-                      <a:ext cx="6120130" cy="2704465"/>
+                      <a:ext cx="5577742" cy="2464785"/>
                     </a:xfrm>
                     <a:prstGeom prst="rect">
                       <a:avLst/>
@@ -1977,6 +2207,7 @@
           <w:b/>
           <w:szCs w:val="28"/>
         </w:rPr>
+        <w:lastRenderedPageBreak/>
         <w:t xml:space="preserve">Заключение. </w:t>
       </w:r>
       <w:r>
@@ -2009,51 +2240,26 @@
     </w:p>
     <w:p>
       <w:r>
-        <w:t xml:space="preserve">Экспериментально установлено: (1) YOLOv8m обеспечивает наилучший mAP@0.5 = 0.957; (2) RT-DETR-l превосходит по точной локализации — mAP@0.5:0.95 = 0.561, однако в </w:t>
-      </w:r>
-      <w:r>
-        <w:t>1</w:t>
-      </w:r>
-      <w:r>
-        <w:t>.</w:t>
-      </w:r>
-      <w:r>
-        <w:t>3</w:t>
-      </w:r>
-      <w:r>
-        <w:t xml:space="preserve"> раза медленнее</w:t>
-      </w:r>
-      <w:r>
-        <w:t xml:space="preserve"> YOLOv8m</w:t>
-      </w:r>
-      <w:r>
-        <w:t>; (3) YOLOv8s является оптимальным выбором для промышленных AOI-систем с учётом баланса точности (mAP@0.5 = 0.944), скорости (</w:t>
-      </w:r>
-      <w:r>
-        <w:t>51</w:t>
-      </w:r>
-      <w:r>
-        <w:t>.</w:t>
-      </w:r>
-      <w:r>
-        <w:t>1</w:t>
-      </w:r>
-      <w:r>
-        <w:t xml:space="preserve"> мс/изображение) и компактности модели (21.5 МБ); (4) класс </w:t>
-      </w:r>
-      <w:proofErr w:type="spellStart"/>
-      <w:r>
-        <w:t>short</w:t>
-      </w:r>
-      <w:proofErr w:type="spellEnd"/>
-      <w:r>
-        <w:t xml:space="preserve"> остаётся наиболее трудным для всех архитектур [5]. Направлениями дальнейших исследований являются применение входного </w:t>
-      </w:r>
-      <w:r>
-        <w:lastRenderedPageBreak/>
-        <w:t>разрешения 1280×1280 для улучшения детекции мелких дефектов, а также тестирование на реальных производственных данных с более широким спектром типов дефектов.</w:t>
-      </w:r>
-    </w:p>
+        <w:t>Экспериментально установлено: (1) YOLOv8m обеспечивает наилучший mAP@0.5 = 0.957; (2) RT-DETR-l превосходит по точной локализации — mAP@0.5:0.95 = 0.561, однако в 1.3 раза медленнее YOLOv8m и в 2.9 раза крупнее; (3) YOLOv8s является оптимальным выбором для промышленных AOI-систем; (4) наиболее трудными для всех архитектур классами являются разрыв цепи и лишняя медь (среднее AP = 0.921 и 0.914 соответственно). Ввиду однократного разбиения датасета (</w:t>
+      </w:r>
+      <w:proofErr w:type="spellStart"/>
+      <w:r>
+        <w:t>seed</w:t>
+      </w:r>
+      <w:proofErr w:type="spellEnd"/>
+      <w:r>
+        <w:t xml:space="preserve">=42) доверительные интервалы для </w:t>
+      </w:r>
+      <w:proofErr w:type="spellStart"/>
+      <w:r>
+        <w:t>mAP</w:t>
+      </w:r>
+      <w:proofErr w:type="spellEnd"/>
+      <w:r>
+        <w:t xml:space="preserve"> не вычислялись; кросс-валидация является направлением дальнейших исследований наряду с применением входного разрешения 1280×1280 для улучшения детекции мелких дефектов и тестированием на реальных производственных данных.</w:t>
+      </w:r>
+    </w:p>
+    <w:p/>
     <w:p>
       <w:pPr>
         <w:pStyle w:val="Caption"/>
@@ -2168,13 +2374,33 @@
       <w:pPr>
         <w:pStyle w:val="References"/>
         <w:rPr>
+          <w:lang w:eastAsia="ru-RU" w:bidi="ar-SA"/>
+        </w:rPr>
+      </w:pPr>
+      <w:r>
+        <w:rPr>
           <w:lang w:val="en-US" w:eastAsia="ru-RU" w:bidi="ar-SA"/>
         </w:rPr>
-      </w:pPr>
+        <w:t xml:space="preserve">Li Q. et al. PCB-DETR: A Detection Network of PCB Surface Defect with Spatial Attention Offset Module // IEEE Access. 2024. Vol. 12. Pp. 158436–158445. </w:t>
+      </w:r>
       <w:r>
         <w:rPr>
           <w:lang w:val="en-US" w:eastAsia="ru-RU" w:bidi="ar-SA"/>
         </w:rPr>
+        <w:t>https://doi.org/10.1109/ACCESS.2024.3486176</w:t>
+      </w:r>
+    </w:p>
+    <w:p>
+      <w:pPr>
+        <w:pStyle w:val="References"/>
+        <w:rPr>
+          <w:lang w:val="en-US" w:eastAsia="ru-RU" w:bidi="ar-SA"/>
+        </w:rPr>
+      </w:pPr>
+      <w:r>
+        <w:rPr>
+          <w:lang w:val="en-US" w:eastAsia="ru-RU" w:bidi="ar-SA"/>
+        </w:rPr>
         <w:t xml:space="preserve">Tang J. et al. Online PCB defect detector on a new PCB defect dataset // </w:t>
       </w:r>
       <w:proofErr w:type="spellStart"/>
@@ -2190,40 +2416,6 @@
           <w:lang w:val="en-US" w:eastAsia="ru-RU" w:bidi="ar-SA"/>
         </w:rPr>
         <w:t>. 2019. arXiv:1902.06197.</w:t>
-      </w:r>
-    </w:p>
-    <w:p>
-      <w:pPr>
-        <w:pStyle w:val="References"/>
-        <w:rPr>
-          <w:lang w:eastAsia="ru-RU" w:bidi="ar-SA"/>
-        </w:rPr>
-      </w:pPr>
-      <w:r>
-        <w:rPr>
-          <w:lang w:val="en-US" w:eastAsia="ru-RU" w:bidi="ar-SA"/>
-        </w:rPr>
-        <w:t xml:space="preserve">Redmon J. et al. You Only Look Once: Unified, Real-Time Object Detection // Proceedings of the IEEE Conference on Computer Vision and Pattern Recognition (CVPR). </w:t>
-      </w:r>
-      <w:r>
-        <w:rPr>
-          <w:lang w:eastAsia="ru-RU" w:bidi="ar-SA"/>
-        </w:rPr>
-        <w:t xml:space="preserve">2016. </w:t>
-      </w:r>
-      <w:proofErr w:type="spellStart"/>
-      <w:r>
-        <w:rPr>
-          <w:lang w:eastAsia="ru-RU" w:bidi="ar-SA"/>
-        </w:rPr>
-        <w:t>Pp</w:t>
-      </w:r>
-      <w:proofErr w:type="spellEnd"/>
-      <w:r>
-        <w:rPr>
-          <w:lang w:eastAsia="ru-RU" w:bidi="ar-SA"/>
-        </w:rPr>
-        <w:t>. 779–788.</w:t>
       </w:r>
     </w:p>
     <w:p/>
@@ -2489,9 +2681,6 @@
     <w:p>
       <w:pPr>
         <w:pStyle w:val="Abstract"/>
-        <w:rPr>
-          <w:lang w:val="en-US"/>
-        </w:rPr>
       </w:pPr>
       <w:r>
         <w:rPr>
@@ -3245,7 +3434,6 @@
   <w:style w:type="character" w:default="1" w:styleId="DefaultParagraphFont">
     <w:name w:val="Default Paragraph Font"/>
     <w:uiPriority w:val="1"/>
-    <w:semiHidden/>
     <w:unhideWhenUsed/>
   </w:style>
   <w:style w:type="table" w:default="1" w:styleId="TableNormal">

</xml_diff>